<commit_message>
Add core Korean default templates
</commit_message>
<xml_diff>
--- a/document-engine/src/main/resources/templates/korean/korean-construction-daily-supervision-log-appendix-2.docx
+++ b/document-engine/src/main/resources/templates/korean/korean-construction-daily-supervision-log-appendix-2.docx
@@ -27,7 +27,7 @@
           <w:b w:val="0"/>
           <w:color w:val="111827"/>
         </w:rPr>
-        <w:t>공 사 감 리 일 지</w:t>
+        <w:t>공사감리일지</w:t>
       </w:r>
     </w:p>
     <w:tbl>
@@ -36,7 +36,6 @@
         <w:tblLayout w:type="fixed"/>
         <w:tblLook w:firstColumn="1" w:firstRow="1" w:lastColumn="0" w:lastRow="0" w:noHBand="0" w:noVBand="1" w:val="04A0"/>
         <w:jc w:val="center"/>
-        <w:tblInd w:w="0" w:type="dxa"/>
         <w:tblBorders>
           <w:top w:val="single" w:sz="6" w:space="0" w:color="5E6A75"/>
           <w:left w:val="single" w:sz="6" w:space="0" w:color="5E6A75"/>
@@ -463,7 +462,7 @@
     </w:tbl>
     <w:p>
       <w:pPr>
-        <w:spacing w:after="40"/>
+        <w:spacing w:after="20"/>
       </w:pPr>
     </w:p>
     <w:p>
@@ -479,20 +478,59 @@
         <w:t>공종 및 세부공정별 감리내용</w:t>
       </w:r>
     </w:p>
+    <w:tbl>
+      <w:tblPr>
+        <w:tblW w:type="dxa" w:w="10205"/>
+        <w:jc w:val="center"/>
+        <w:tblLayout w:type="fixed"/>
+        <w:tblLook w:firstColumn="1" w:firstRow="1" w:lastColumn="0" w:lastRow="0" w:noHBand="0" w:noVBand="1" w:val="04A0"/>
+        <w:tblBorders>
+          <w:top w:val="single" w:sz="6" w:space="0" w:color="5E6A75"/>
+          <w:left w:val="single" w:sz="6" w:space="0" w:color="5E6A75"/>
+          <w:bottom w:val="single" w:sz="6" w:space="0" w:color="5E6A75"/>
+          <w:right w:val="single" w:sz="6" w:space="0" w:color="5E6A75"/>
+          <w:insideH w:val="single" w:sz="6" w:space="0" w:color="5E6A75"/>
+          <w:insideV w:val="single" w:sz="6" w:space="0" w:color="5E6A75"/>
+        </w:tblBorders>
+      </w:tblPr>
+      <w:tblGrid>
+        <w:gridCol w:w="10205"/>
+      </w:tblGrid>
+      <w:tr>
+        <w:tc>
+          <w:tcPr>
+            <w:tcW w:type="dxa" w:w="10376"/>
+            <w:vAlign w:val="center"/>
+            <w:tcMar>
+              <w:top w:w="70" w:type="dxa"/>
+              <w:bottom w:w="70" w:type="dxa"/>
+              <w:start w:w="110" w:type="dxa"/>
+              <w:end w:w="110" w:type="dxa"/>
+            </w:tcMar>
+          </w:tcPr>
+          <w:p>
+            <w:pPr>
+              <w:spacing w:after="0"/>
+              <w:jc w:val="center"/>
+            </w:pPr>
+            <w:r/>
+            <w:r>
+              <w:rPr>
+                <w:rFonts w:ascii="Malgun Gothic" w:hAnsi="Malgun Gothic" w:eastAsia="Malgun Gothic"/>
+                <w:b w:val="0"/>
+                <w:color w:val="374151"/>
+                <w:sz w:val="17"/>
+              </w:rPr>
+              <w:t>${supervisionItemsSection}</w:t>
+            </w:r>
+          </w:p>
+        </w:tc>
+      </w:tr>
+    </w:tbl>
     <w:p>
       <w:pPr>
-        <w:spacing w:before="40" w:after="80"/>
-        <w:jc w:val="center"/>
+        <w:spacing w:after="20"/>
       </w:pPr>
-      <w:r>
-        <w:rPr>
-          <w:rFonts w:ascii="Malgun Gothic" w:hAnsi="Malgun Gothic" w:eastAsia="Malgun Gothic"/>
-          <w:b w:val="0"/>
-          <w:color w:val="374151"/>
-          <w:sz w:val="18"/>
-        </w:rPr>
-        <w:t>${supervisionItemsSection}</w:t>
-      </w:r>
     </w:p>
     <w:tbl>
       <w:tblPr>
@@ -500,7 +538,6 @@
         <w:tblLayout w:type="fixed"/>
         <w:tblLook w:firstColumn="1" w:firstRow="1" w:lastColumn="0" w:lastRow="0" w:noHBand="0" w:noVBand="1" w:val="04A0"/>
         <w:jc w:val="center"/>
-        <w:tblInd w:w="0" w:type="dxa"/>
         <w:tblBorders>
           <w:top w:val="single" w:sz="6" w:space="0" w:color="5E6A75"/>
           <w:left w:val="single" w:sz="6" w:space="0" w:color="5E6A75"/>
@@ -635,7 +672,142 @@
     </w:tbl>
     <w:p>
       <w:pPr>
-        <w:spacing w:after="40"/>
+        <w:spacing w:after="20"/>
+      </w:pPr>
+    </w:p>
+    <w:p>
+      <w:pPr>
+        <w:pStyle w:val="Heading1"/>
+      </w:pPr>
+      <w:r>
+        <w:rPr>
+          <w:rFonts w:ascii="Malgun Gothic" w:hAnsi="Malgun Gothic" w:eastAsia="Malgun Gothic"/>
+          <w:b w:val="0"/>
+          <w:color w:val="111827"/>
+        </w:rPr>
+        <w:t>체크 항목별 사진</w:t>
+      </w:r>
+    </w:p>
+    <w:tbl>
+      <w:tblPr>
+        <w:tblW w:type="dxa" w:w="10205"/>
+        <w:jc w:val="center"/>
+        <w:tblLayout w:type="fixed"/>
+        <w:tblLook w:firstColumn="1" w:firstRow="1" w:lastColumn="0" w:lastRow="0" w:noHBand="0" w:noVBand="1" w:val="04A0"/>
+        <w:tblBorders>
+          <w:top w:val="single" w:sz="6" w:space="0" w:color="5E6A75"/>
+          <w:left w:val="single" w:sz="6" w:space="0" w:color="5E6A75"/>
+          <w:bottom w:val="single" w:sz="6" w:space="0" w:color="5E6A75"/>
+          <w:right w:val="single" w:sz="6" w:space="0" w:color="5E6A75"/>
+          <w:insideH w:val="single" w:sz="6" w:space="0" w:color="5E6A75"/>
+          <w:insideV w:val="single" w:sz="6" w:space="0" w:color="5E6A75"/>
+        </w:tblBorders>
+      </w:tblPr>
+      <w:tblGrid>
+        <w:gridCol w:w="10205"/>
+      </w:tblGrid>
+      <w:tr>
+        <w:tc>
+          <w:tcPr>
+            <w:tcW w:type="dxa" w:w="10376"/>
+            <w:shd w:fill="EFE7C6"/>
+            <w:vAlign w:val="center"/>
+            <w:tcMar>
+              <w:top w:w="70" w:type="dxa"/>
+              <w:bottom w:w="70" w:type="dxa"/>
+              <w:start w:w="110" w:type="dxa"/>
+              <w:end w:w="110" w:type="dxa"/>
+            </w:tcMar>
+          </w:tcPr>
+          <w:p>
+            <w:pPr>
+              <w:spacing w:after="0"/>
+              <w:jc w:val="center"/>
+            </w:pPr>
+            <w:r/>
+            <w:r>
+              <w:rPr>
+                <w:rFonts w:ascii="Malgun Gothic" w:hAnsi="Malgun Gothic" w:eastAsia="Malgun Gothic"/>
+                <w:b w:val="0"/>
+                <w:color w:val="374151"/>
+                <w:sz w:val="17"/>
+              </w:rPr>
+              <w:t>${checklistPhotoSection}</w:t>
+            </w:r>
+          </w:p>
+        </w:tc>
+      </w:tr>
+    </w:tbl>
+    <w:p>
+      <w:pPr>
+        <w:spacing w:after="20"/>
+      </w:pPr>
+    </w:p>
+    <w:p>
+      <w:pPr>
+        <w:pStyle w:val="Heading1"/>
+      </w:pPr>
+      <w:r>
+        <w:rPr>
+          <w:rFonts w:ascii="Malgun Gothic" w:hAnsi="Malgun Gothic" w:eastAsia="Malgun Gothic"/>
+          <w:b w:val="0"/>
+          <w:color w:val="111827"/>
+        </w:rPr>
+        <w:t>현장 사진</w:t>
+      </w:r>
+    </w:p>
+    <w:tbl>
+      <w:tblPr>
+        <w:tblW w:type="dxa" w:w="10205"/>
+        <w:jc w:val="center"/>
+        <w:tblLayout w:type="fixed"/>
+        <w:tblLook w:firstColumn="1" w:firstRow="1" w:lastColumn="0" w:lastRow="0" w:noHBand="0" w:noVBand="1" w:val="04A0"/>
+        <w:tblBorders>
+          <w:top w:val="single" w:sz="6" w:space="0" w:color="5E6A75"/>
+          <w:left w:val="single" w:sz="6" w:space="0" w:color="5E6A75"/>
+          <w:bottom w:val="single" w:sz="6" w:space="0" w:color="5E6A75"/>
+          <w:right w:val="single" w:sz="6" w:space="0" w:color="5E6A75"/>
+          <w:insideH w:val="single" w:sz="6" w:space="0" w:color="5E6A75"/>
+          <w:insideV w:val="single" w:sz="6" w:space="0" w:color="5E6A75"/>
+        </w:tblBorders>
+      </w:tblPr>
+      <w:tblGrid>
+        <w:gridCol w:w="10205"/>
+      </w:tblGrid>
+      <w:tr>
+        <w:tc>
+          <w:tcPr>
+            <w:tcW w:type="dxa" w:w="10376"/>
+            <w:vAlign w:val="center"/>
+            <w:tcMar>
+              <w:top w:w="70" w:type="dxa"/>
+              <w:bottom w:w="70" w:type="dxa"/>
+              <w:start w:w="110" w:type="dxa"/>
+              <w:end w:w="110" w:type="dxa"/>
+            </w:tcMar>
+          </w:tcPr>
+          <w:p>
+            <w:pPr>
+              <w:spacing w:after="0"/>
+              <w:jc w:val="center"/>
+            </w:pPr>
+            <w:r/>
+            <w:r>
+              <w:rPr>
+                <w:rFonts w:ascii="Malgun Gothic" w:hAnsi="Malgun Gothic" w:eastAsia="Malgun Gothic"/>
+                <w:b w:val="0"/>
+                <w:color w:val="374151"/>
+                <w:sz w:val="17"/>
+              </w:rPr>
+              <w:t>${photoSection}</w:t>
+            </w:r>
+          </w:p>
+        </w:tc>
+      </w:tr>
+    </w:tbl>
+    <w:p>
+      <w:pPr>
+        <w:spacing w:after="20"/>
       </w:pPr>
     </w:p>
     <w:p>
@@ -653,8 +825,8 @@
     </w:p>
     <w:p>
       <w:pPr>
-        <w:spacing w:after="30"/>
-        <w:ind w:left="142" w:hanging="142"/>
+        <w:spacing w:after="20"/>
+        <w:ind w:left="159" w:hanging="159"/>
       </w:pPr>
       <w:r>
         <w:rPr>
@@ -663,13 +835,13 @@
           <w:color w:val="4B5563"/>
           <w:sz w:val="15"/>
         </w:rPr>
-        <w:t>1. 공종에는 주요공종 및 단위공종 그리고 해당 층수를 기재합니다.</w:t>
+        <w:t>1. 공종에는 주요공종 및 단위공종, 해당 층수 또는 구역을 기록합니다.</w:t>
       </w:r>
     </w:p>
     <w:p>
       <w:pPr>
-        <w:spacing w:after="30"/>
-        <w:ind w:left="142" w:hanging="142"/>
+        <w:spacing w:after="20"/>
+        <w:ind w:left="159" w:hanging="159"/>
       </w:pPr>
       <w:r>
         <w:rPr>
@@ -678,13 +850,13 @@
           <w:color w:val="4B5563"/>
           <w:sz w:val="15"/>
         </w:rPr>
-        <w:t>2. 감리항목은 공종별 감리 체크리스트를 기반으로 기재합니다.</w:t>
+        <w:t>2. 감리항목은 공종별 감리 체크리스트와 현장 확인사항을 기준으로 작성합니다.</w:t>
       </w:r>
     </w:p>
     <w:p>
       <w:pPr>
-        <w:spacing w:after="30"/>
-        <w:ind w:left="142" w:hanging="142"/>
+        <w:spacing w:after="20"/>
+        <w:ind w:left="159" w:hanging="159"/>
       </w:pPr>
       <w:r>
         <w:rPr>
@@ -693,13 +865,13 @@
           <w:color w:val="4B5563"/>
           <w:sz w:val="15"/>
         </w:rPr>
-        <w:t>3. 감리내용에는 육안검사, 입회, 시험 등 감리내용과 결과를 구체적으로 기재합니다.</w:t>
+        <w:t>3. 감리내용에는 도면ㆍ시방ㆍ자재ㆍ시공상태 확인 내용과 조치 결과를 구체적으로 기록합니다.</w:t>
       </w:r>
     </w:p>
     <w:p>
       <w:pPr>
-        <w:spacing w:after="30"/>
-        <w:ind w:left="142" w:hanging="142"/>
+        <w:spacing w:after="20"/>
+        <w:ind w:left="159" w:hanging="159"/>
       </w:pPr>
       <w:r>
         <w:rPr>
@@ -708,13 +880,13 @@
           <w:color w:val="4B5563"/>
           <w:sz w:val="15"/>
         </w:rPr>
-        <w:t>4. 특기사항은 특별히 명기되어 있지 아니한 내용의 발생 및 조치사항을 기재합니다.</w:t>
+        <w:t>4. 특기사항은 별도로 명기하여야 하는 내용, 현장 여건, 협의사항을 기록합니다.</w:t>
       </w:r>
     </w:p>
     <w:p>
       <w:pPr>
-        <w:spacing w:after="30"/>
-        <w:ind w:left="142" w:hanging="142"/>
+        <w:spacing w:after="20"/>
+        <w:ind w:left="159" w:hanging="159"/>
       </w:pPr>
       <w:r>
         <w:rPr>
@@ -723,12 +895,12 @@
           <w:color w:val="4B5563"/>
           <w:sz w:val="15"/>
         </w:rPr>
-        <w:t>5. 지적사항 및 처리결과는 재시공, 공사중지 등 지시내용과 처리결과를 기재합니다.</w:t>
+        <w:t>5. 지적사항 및 처리결과에는 시정 지시, 보완 요청, 처리 완료 여부를 함께 기록합니다.</w:t>
       </w:r>
     </w:p>
     <w:sectPr>
       <w:pgSz w:w="11906" w:h="16838"/>
-      <w:pgMar w:top="709" w:right="765" w:bottom="709" w:left="765" w:header="454" w:footer="454" w:gutter="0"/>
+      <w:pgMar w:top="680" w:right="765" w:bottom="680" w:left="765" w:header="397" w:footer="397" w:gutter="0"/>
       <w:cols w:space="720"/>
       <w:docGrid w:linePitch="360"/>
     </w:sectPr>
@@ -1100,12 +1272,13 @@
     <w:qFormat/>
     <w:rsid w:val="00FC693F"/>
     <w:pPr>
-      <w:spacing w:after="60" w:line="276" w:lineRule="auto"/>
+      <w:spacing w:after="60" w:line="269" w:lineRule="auto"/>
     </w:pPr>
     <w:rPr>
       <w:rFonts w:ascii="Malgun Gothic" w:hAnsi="Malgun Gothic" w:eastAsia="Malgun Gothic"/>
+      <w:b w:val="0"/>
       <w:color w:val="111827"/>
-      <w:sz w:val="19"/>
+      <w:sz w:val="18"/>
     </w:rPr>
   </w:style>
   <w:style w:type="paragraph" w:styleId="Header">
@@ -1171,7 +1344,7 @@
       <w:b/>
       <w:bCs/>
       <w:color w:val="1F3A5F"/>
-      <w:sz w:val="24"/>
+      <w:sz w:val="23"/>
       <w:szCs w:val="28"/>
     </w:rPr>
   </w:style>
@@ -1195,7 +1368,7 @@
       <w:b/>
       <w:bCs/>
       <w:color w:val="1F3A5F"/>
-      <w:sz w:val="21"/>
+      <w:sz w:val="20"/>
       <w:szCs w:val="26"/>
     </w:rPr>
   </w:style>
@@ -1215,7 +1388,7 @@
       <w:outlineLvl w:val="2"/>
     </w:pPr>
     <w:rPr>
-      <w:rFonts w:asciiTheme="majorHAnsi" w:eastAsiaTheme="majorEastAsia" w:hAnsiTheme="majorHAnsi" w:cstheme="majorBidi" w:ascii="Malgun Gothic" w:hAnsi="Malgun Gothic" w:eastAsia="Malgun Gothic"/>
+      <w:rFonts w:asciiTheme="majorHAnsi" w:eastAsiaTheme="majorEastAsia" w:hAnsiTheme="majorHAnsi" w:cstheme="majorBidi"/>
       <w:b/>
       <w:bCs/>
       <w:color w:val="4F81BD" w:themeColor="accent1"/>
@@ -1452,7 +1625,7 @@
       <w:pBdr>
         <w:bottom w:val="single" w:sz="8" w:space="4" w:color="4F81BD" w:themeColor="accent1"/>
       </w:pBdr>
-      <w:spacing w:after="120" w:line="240" w:lineRule="auto"/>
+      <w:spacing w:after="100" w:line="240" w:lineRule="auto"/>
       <w:contextualSpacing/>
     </w:pPr>
     <w:rPr>

</xml_diff>